<commit_message>
vault sync: 2026-10-10 23:57:48 EDT
</commit_message>
<xml_diff>
--- a/second-brain/Myhousing/3401 Hamiltion Philly/Roommate_Agreement_3401_Hamilton.docx
+++ b/second-brain/Myhousing/3401 Hamiltion Philly/Roommate_Agreement_3401_Hamilton.docx
@@ -243,7 +243,7 @@
         <w:spacing w:after="120"/>
       </w:pPr>
       <w:r>
-        <w:t>Each Roommate is responsible for submitting their individual share directly via Buildium by the 1st of each month. No Roommate is obligated to front rent for another. However, because the Master Lease holds all Roommates jointly and severally liable, if any Roommate fails to pay, the remaining Roommates may choose (but are not required) to cover the shortfall and seek reimbursement from the defaulting Roommate, who shall owe the covering Roommates the advanced amount plus a $25 late fee per week until repaid.</w:t>
+        <w:t>Each Roommate is responsible for submitting their individual share directly via Buildium by the 1st of each month. No Roommate is obligated to front rent for another. However, because the Master Lease holds all Roommates jointly and severally liable, if any Roommate fails to pay, the remaining Roommates may choose (but are not required) to cover the shortfall and seek reimbursement from the defaulting Roommate, who shall owe the covering Roommates the advanced amount plus a flat $250 late fee.</w:t>
       </w:r>
     </w:p>
     <w:p>
@@ -403,7 +403,7 @@
         <w:spacing w:after="120"/>
       </w:pPr>
       <w:r>
-        <w:t>Accounts for electricity and gas must be established in at least one Roommate's name prior to move-in. The Roommate whose name is on each utility account ("Billing Roommate") will share the bill with all others within 5 days of receipt. Each Roommate will pay their equal share within 3 days of receiving the bill from the Billing Roommate. Late payment of a shared utility bill will accrue a $10 per day late fee payable to the Billing Roommate for each day past the 3-day window. The group may rotate who holds each account annually or by mutual agreement.</w:t>
+        <w:t>Accounts for electricity and gas must be established in at least one Roommate's name prior to move-in. The Roommate whose name is on each utility account ("Billing Roommate") will share the bill with all others within 5 days of receipt. Each Roommate will pay their equal share within 3 days of receiving the bill from the Billing Roommate. If any Roommate's late payment causes the utility company (PECO/PGW) to assess a late fee or penalty on the account, the Roommate whose late payment caused the fee is solely responsible for paying that entire late fee, in full, regardless of how many Roommates are on the account. The group may rotate who holds each account annually or by mutual agreement.</w:t>
       </w:r>
     </w:p>
     <w:p>
@@ -712,7 +712,7 @@
         <w:spacing w:after="120"/>
       </w:pPr>
       <w:r>
-        <w:t>If the Departing Roommate fails to pay their share while absent and no Subletter is in place, the remaining Roommates may cover the shortfall to avoid late fees, and the Departing Roommate will owe the covering Roommates that amount plus a $25 per week late fee until fully repaid.</w:t>
+        <w:t>If the Departing Roommate fails to pay their share while absent and no Subletter is in place, the remaining Roommates may cover the shortfall to avoid late fees, and the Departing Roommate will owe the covering Roommates that amount plus a flat $250 late fee. The Departing Roommate must continue paying their full share of rent and other obligations for as long as no Subletter has been found, approved, and executed a sublease agreement — there is no limit on how long this obligation continues.</w:t>
       </w:r>
     </w:p>
     <w:p>
@@ -883,15 +883,15 @@
           <w:szCs w:val="24"/>
           <w:u w:val="single"/>
         </w:rPr>
-        <w:t>8. LEASE RENEWAL</w:t>
-      </w:r>
-    </w:p>
-    <w:p>
-      <w:pPr>
-        <w:spacing w:after="120"/>
-      </w:pPr>
-      <w:r>
-        <w:t>The Master Lease requires written notice of intent to renew by February 1st of each year. Roommates agree to collectively discuss renewal intentions no later than January 1st of each applicable year. Any Roommate wishing to leave at the end of the term must notify all other Roommates in writing no later than December 1st. That Roommate then has the same obligation to find a replacement as described in Section 6.</w:t>
+        <w:t>8. DISPUTE RESOLUTION</w:t>
+      </w:r>
+    </w:p>
+    <w:p>
+      <w:pPr>
+        <w:spacing w:after="120"/>
+      </w:pPr>
+      <w:r>
+        <w:t>Roommates agree to first attempt to resolve any dispute informally through good-faith discussion. If unresolved within 7 days, the matter will be put to a majority vote of all Roommates. Decisions made by majority vote are binding on all parties. This Agreement does not limit any party's legal rights under Pennsylvania law or the Master Lease.</w:t>
       </w:r>
     </w:p>
     <w:p>
@@ -906,15 +906,15 @@
           <w:szCs w:val="24"/>
           <w:u w:val="single"/>
         </w:rPr>
-        <w:t>9. DISPUTE RESOLUTION</w:t>
-      </w:r>
-    </w:p>
-    <w:p>
-      <w:pPr>
-        <w:spacing w:after="120"/>
-      </w:pPr>
-      <w:r>
-        <w:t>Roommates agree to first attempt to resolve any dispute informally through good-faith discussion. If unresolved within 7 days, the matter will be put to a majority vote of all Roommates. Decisions made by majority vote are binding on all parties. This Agreement does not limit any party's legal rights under Pennsylvania law or the Master Lease.</w:t>
+        <w:t>9. AMENDMENTS</w:t>
+      </w:r>
+    </w:p>
+    <w:p>
+      <w:pPr>
+        <w:spacing w:after="120"/>
+      </w:pPr>
+      <w:r>
+        <w:t>This Agreement may be amended by written consent of all Roommates currently occupying the unit. Any amendment must be signed and dated by all parties and attached to this Agreement.</w:t>
       </w:r>
     </w:p>
     <w:p>
@@ -929,30 +929,7 @@
           <w:szCs w:val="24"/>
           <w:u w:val="single"/>
         </w:rPr>
-        <w:t>10. AMENDMENTS</w:t>
-      </w:r>
-    </w:p>
-    <w:p>
-      <w:pPr>
-        <w:spacing w:after="120"/>
-      </w:pPr>
-      <w:r>
-        <w:t>This Agreement may be amended by written consent of all Roommates currently occupying the unit. Any amendment must be signed and dated by all parties and attached to this Agreement.</w:t>
-      </w:r>
-    </w:p>
-    <w:p>
-      <w:pPr>
-        <w:spacing w:before="280" w:after="100"/>
-      </w:pPr>
-      <w:r>
-        <w:rPr>
-          <w:b/>
-          <w:bCs/>
-          <w:sz w:val="24"/>
-          <w:szCs w:val="24"/>
-          <w:u w:val="single"/>
-        </w:rPr>
-        <w:t>11. GOVERNING LAW</w:t>
+        <w:t>10. GOVERNING LAW</w:t>
       </w:r>
     </w:p>
     <w:p>

</xml_diff>